<commit_message>
Update author list: Binh, Trung (corresponding), Hanh, Diep
Co-Authored-By: Claude Opus 5.5 <noreply@anthropic.com>
Claude-Session: https://claude.ai/code/session_01DV1FpN7pyDPdia8AQncgwU
</commit_message>
<xml_diff>
--- a/manuscript/Manuscript_with_Author_Details.docx
+++ b/manuscript/Manuscript_with_Author_Details.docx
@@ -42,13 +42,23 @@
       </w:r>
       <w:r>
         <w:rPr/>
-        <w:t>*, Nguyen Anh Tuan</w:t>
+        <w:t>*, Ha Hong Hanh</w:t>
       </w:r>
       <w:r>
         <w:rPr>
           <w:vertAlign w:val="superscript"/>
         </w:rPr>
         <w:t>b</w:t>
+      </w:r>
+      <w:r>
+        <w:rPr/>
+        <w:t>, Nguyen Bach Diep</w:t>
+      </w:r>
+      <w:r>
+        <w:rPr>
+          <w:vertAlign w:val="superscript"/>
+        </w:rPr>
+        <w:t>a</w:t>
       </w:r>
     </w:p>
     <w:p>
@@ -80,7 +90,7 @@
       </w:r>
       <w:r>
         <w:rPr/>
-        <w:t xml:space="preserve"> Foreign Trade University, 91 Chua Lang Street, Dong Da District, Hanoi, Vietnam</w:t>
+        <w:t xml:space="preserve"> School of Accounting and Auditing, National Economics University, Hanoi, Vietnam</w:t>
       </w:r>
     </w:p>
     <w:p>
@@ -90,7 +100,7 @@
       </w:pPr>
       <w:r>
         <w:rPr/>
-        <w:t>* Corresponding author: Nguyen Van Trung, Academy of Policy and Development. Email: kontrungcany@gmail.com. Tel: +84 355 347 831.</w:t>
+        <w:t>* Corresponding author: Nguyen Van Trung, Academy of Policy and Development, Nam An Khanh Urban Area, Hoai Duc District, Hanoi, Vietnam. Email: 15233582@st.neu.edu.vn. Tel: +84 355 347 831.</w:t>
       </w:r>
     </w:p>
     <w:p>
@@ -100,7 +110,37 @@
       </w:pPr>
       <w:r>
         <w:rPr/>
-        <w:t>Nguyen Thanh Binh: nguyenthanhbinhapd@apd.edu.vn (ORCID 0009-0007-0042-2835); Nguyen Van Trung: kontrungcany@gmail.com (ORCID 0009-0008-3307-6569); Nguyen Anh Tuan: nguyenanhtuan17105@gmail.com (ORCID 0009-0000-1901-1541)</w:t>
+        <w:t>Nguyen Thanh Binh: nguyenthanhbinhapd@apd.edu.vn; ORCID 0009-0007-0042-2835</w:t>
+      </w:r>
+    </w:p>
+    <w:p>
+      <w:pPr>
+        <w:spacing w:line="240" w:lineRule="auto" w:after="80" w:before="0"/>
+        <w:jc w:val="center"/>
+      </w:pPr>
+      <w:r>
+        <w:rPr/>
+        <w:t>Nguyen Van Trung: 15233582@st.neu.edu.vn; ORCID 0009-0008-3307-6569</w:t>
+      </w:r>
+    </w:p>
+    <w:p>
+      <w:pPr>
+        <w:spacing w:line="240" w:lineRule="auto" w:after="80" w:before="0"/>
+        <w:jc w:val="center"/>
+      </w:pPr>
+      <w:r>
+        <w:rPr/>
+        <w:t>Ha Hong Hanh: hanhhh@neu.edu.vn; ORCID 0000-0003-3581-6571</w:t>
+      </w:r>
+    </w:p>
+    <w:p>
+      <w:pPr>
+        <w:spacing w:line="240" w:lineRule="auto" w:after="80" w:before="0"/>
+        <w:jc w:val="center"/>
+      </w:pPr>
+      <w:r>
+        <w:rPr/>
+        <w:t>Nguyen Bach Diep: diepnb@apd.edu.vn; ORCID 0009-0003-0967-7528</w:t>
       </w:r>
     </w:p>
     <w:p>
@@ -259,7 +299,7 @@
       </w:pPr>
       <w:r>
         <w:rPr/>
-        <w:t>Nguyen Thanh Binh has nothing to disclose. Nguyen Van Trung has nothing to disclose. Nguyen Anh Tuan has nothing to disclose.</w:t>
+        <w:t>Nguyen Thanh Binh has nothing to disclose. Nguyen Van Trung has nothing to disclose. Ha Hong Hanh has nothing to disclose. Nguyen Bach Diep has nothing to disclose.</w:t>
       </w:r>
     </w:p>
     <w:p>
@@ -307,7 +347,7 @@
       </w:pPr>
       <w:r>
         <w:rPr/>
-        <w:t>Nguyen Thanh Binh: Conceptualization, Supervision, Writing (review and editing). Nguyen Van Trung: Conceptualization, Data curation, Formal analysis, Methodology, Software, Visualization, Writing (original draft). Nguyen Anh Tuan: Data curation, Validation, Writing (review and editing).</w:t>
+        <w:t>Nguyen Thanh Binh: Conceptualization, Supervision, Writing (review and editing). Nguyen Van Trung: Conceptualization, Data curation, Formal analysis, Methodology, Software, Visualization, Writing (original draft). Ha Hong Hanh: Methodology, Validation, Writing (review and editing). Nguyen Bach Diep: Data curation, Validation, Writing (review and editing).</w:t>
       </w:r>
     </w:p>
     <w:p>

</xml_diff>